<commit_message>
BA Part 4 (AI): one action per When, clearer 5 Whys chain, DoR roles and INVEST, README traces
Co-Authored-By: Claude Opus 5.5 <noreply@anthropic.com>
</commit_message>
<xml_diff>
--- a/BA/Part 4_Requirements Documentation-20260912/Done/AI/Artifacts/1. User Stories_VNS.docx
+++ b/BA/Part 4_Requirements Documentation-20260912/Done/AI/Artifacts/1. User Stories_VNS.docx
@@ -166,7 +166,7 @@
           <w:sz w:val="24"/>
           <w:szCs w:val="24"/>
         </w:rPr>
-        <w:t xml:space="preserve">to see the task, the deadline and the maximum points of a lab on one page and submit my report there</w:t>
+        <w:t xml:space="preserve">to submit my lab report on the page where the task, the deadline and the maximum points of the lab are shown</w:t>
       </w:r>
       <w:r>
         <w:rPr>
@@ -387,7 +387,7 @@
           <w:sz w:val="24"/>
           <w:szCs w:val="24"/>
         </w:rPr>
-        <w:t xml:space="preserve"> Submit a report before the deadline</w:t>
+        <w:t xml:space="preserve"> Submit a report</w:t>
       </w:r>
     </w:p>
     <w:p>
@@ -446,7 +446,7 @@
           <w:sz w:val="24"/>
           <w:szCs w:val="24"/>
         </w:rPr>
-        <w:t xml:space="preserve"> the deadline of Lab 3 has not passed</w:t>
+        <w:t xml:space="preserve"> Student has added the file “lab3_report.pdf” with the “Choose file” button</w:t>
       </w:r>
     </w:p>
     <w:p>
@@ -475,7 +475,7 @@
           <w:sz w:val="24"/>
           <w:szCs w:val="24"/>
         </w:rPr>
-        <w:t xml:space="preserve"> Student adds the file “lab3_report.pdf” with the “Choose file” button and presses “Submit”</w:t>
+        <w:t xml:space="preserve"> Student presses “Submit”</w:t>
       </w:r>
     </w:p>
     <w:p>
@@ -922,6 +922,36 @@
       <w:pPr>
         <w:keepNext/>
         <w:spacing w:after="60"/>
+        <w:ind w:firstLine="720"/>
+        <w:rPr>
+          <w:rFonts w:ascii="Times New Roman" w:hAnsi="Times New Roman" w:cs="Times New Roman"/>
+          <w:sz w:val="24"/>
+          <w:szCs w:val="24"/>
+        </w:rPr>
+      </w:pPr>
+      <w:r>
+        <w:rPr>
+          <w:rFonts w:ascii="Times New Roman" w:hAnsi="Times New Roman" w:cs="Times New Roman"/>
+          <w:b/>
+          <w:bCs/>
+          <w:sz w:val="24"/>
+          <w:szCs w:val="24"/>
+        </w:rPr>
+        <w:t xml:space="preserve">And</w:t>
+      </w:r>
+      <w:r>
+        <w:rPr>
+          <w:rFonts w:ascii="Times New Roman" w:hAnsi="Times New Roman" w:cs="Times New Roman"/>
+          <w:sz w:val="24"/>
+          <w:szCs w:val="24"/>
+        </w:rPr>
+        <w:t xml:space="preserve"> Student has typed “Can we use an adjacency matrix instead of a list?” in the “Ask the lecturer...” field</w:t>
+      </w:r>
+    </w:p>
+    <w:p>
+      <w:pPr>
+        <w:keepNext/>
+        <w:spacing w:after="60"/>
         <w:rPr>
           <w:rFonts w:ascii="Times New Roman" w:hAnsi="Times New Roman" w:cs="Times New Roman"/>
           <w:sz w:val="24"/>
@@ -944,7 +974,7 @@
           <w:sz w:val="24"/>
           <w:szCs w:val="24"/>
         </w:rPr>
-        <w:t xml:space="preserve"> Student types “Can we use an adjacency matrix instead of a list?” in the “Ask the lecturer...” field and presses “Send”</w:t>
+        <w:t xml:space="preserve"> Student presses “Send”</w:t>
       </w:r>
     </w:p>
     <w:p>
@@ -1679,6 +1709,36 @@
       <w:pPr>
         <w:keepNext/>
         <w:spacing w:after="60"/>
+        <w:ind w:firstLine="720"/>
+        <w:rPr>
+          <w:rFonts w:ascii="Times New Roman" w:hAnsi="Times New Roman" w:cs="Times New Roman"/>
+          <w:sz w:val="24"/>
+          <w:szCs w:val="24"/>
+        </w:rPr>
+      </w:pPr>
+      <w:r>
+        <w:rPr>
+          <w:rFonts w:ascii="Times New Roman" w:hAnsi="Times New Roman" w:cs="Times New Roman"/>
+          <w:b/>
+          <w:bCs/>
+          <w:sz w:val="24"/>
+          <w:szCs w:val="24"/>
+        </w:rPr>
+        <w:t xml:space="preserve">And</w:t>
+      </w:r>
+      <w:r>
+        <w:rPr>
+          <w:rFonts w:ascii="Times New Roman" w:hAnsi="Times New Roman" w:cs="Times New Roman"/>
+          <w:sz w:val="24"/>
+          <w:szCs w:val="24"/>
+        </w:rPr>
+        <w:t xml:space="preserve"> Lecturer has entered 8 in the “Points” field and written a comment</w:t>
+      </w:r>
+    </w:p>
+    <w:p>
+      <w:pPr>
+        <w:keepNext/>
+        <w:spacing w:after="60"/>
         <w:rPr>
           <w:rFonts w:ascii="Times New Roman" w:hAnsi="Times New Roman" w:cs="Times New Roman"/>
           <w:sz w:val="24"/>
@@ -1701,7 +1761,7 @@
           <w:sz w:val="24"/>
           <w:szCs w:val="24"/>
         </w:rPr>
-        <w:t xml:space="preserve"> Lecturer enters 8 in the “Points” field, writes a comment and presses “Save grade”</w:t>
+        <w:t xml:space="preserve"> Lecturer presses “Save grade”</w:t>
       </w:r>
     </w:p>
     <w:p>
@@ -1823,6 +1883,36 @@
       <w:pPr>
         <w:keepNext/>
         <w:spacing w:after="60"/>
+        <w:ind w:firstLine="720"/>
+        <w:rPr>
+          <w:rFonts w:ascii="Times New Roman" w:hAnsi="Times New Roman" w:cs="Times New Roman"/>
+          <w:sz w:val="24"/>
+          <w:szCs w:val="24"/>
+        </w:rPr>
+      </w:pPr>
+      <w:r>
+        <w:rPr>
+          <w:rFonts w:ascii="Times New Roman" w:hAnsi="Times New Roman" w:cs="Times New Roman"/>
+          <w:b/>
+          <w:bCs/>
+          <w:sz w:val="24"/>
+          <w:szCs w:val="24"/>
+        </w:rPr>
+        <w:t xml:space="preserve">And</w:t>
+      </w:r>
+      <w:r>
+        <w:rPr>
+          <w:rFonts w:ascii="Times New Roman" w:hAnsi="Times New Roman" w:cs="Times New Roman"/>
+          <w:sz w:val="24"/>
+          <w:szCs w:val="24"/>
+        </w:rPr>
+        <w:t xml:space="preserve"> Lecturer has entered 12 in the “Points” field</w:t>
+      </w:r>
+    </w:p>
+    <w:p>
+      <w:pPr>
+        <w:keepNext/>
+        <w:spacing w:after="60"/>
         <w:rPr>
           <w:rFonts w:ascii="Times New Roman" w:hAnsi="Times New Roman" w:cs="Times New Roman"/>
           <w:sz w:val="24"/>
@@ -1845,7 +1935,7 @@
           <w:sz w:val="24"/>
           <w:szCs w:val="24"/>
         </w:rPr>
-        <w:t xml:space="preserve"> Lecturer enters 12 in the “Points” field and presses “Save grade”</w:t>
+        <w:t xml:space="preserve"> Lecturer presses “Save grade”</w:t>
       </w:r>
     </w:p>
     <w:p>

</xml_diff>

<commit_message>
BA Part 4 (AI): add dean's office story (US #4) and a Release 1 group-monitoring sticker
Co-Authored-By: Claude Sonnet 5.5 <noreply@anthropic.com>
</commit_message>
<xml_diff>
--- a/BA/Part 4_Requirements Documentation-20260912/Done/AI/Artifacts/1. User Stories_VNS.docx
+++ b/BA/Part 4_Requirements Documentation-20260912/Done/AI/Artifacts/1. User Stories_VNS.docx
@@ -1993,6 +1993,679 @@
           <w:szCs w:val="24"/>
         </w:rPr>
         <w:t xml:space="preserve"> the “Ask the lecturer...” field is replaced by the message “Questions about this lab are closed”</w:t>
+      </w:r>
+    </w:p>
+    <w:p>
+      <w:pPr>
+        <w:rPr>
+          <w:rFonts w:ascii="Times New Roman" w:hAnsi="Times New Roman" w:cs="Times New Roman"/>
+          <w:sz w:val="24"/>
+          <w:szCs w:val="24"/>
+        </w:rPr>
+      </w:pPr>
+    </w:p>
+    <w:p>
+      <w:pPr>
+        <w:rPr>
+          <w:rFonts w:ascii="Times New Roman" w:hAnsi="Times New Roman" w:cs="Times New Roman"/>
+          <w:sz w:val="24"/>
+          <w:szCs w:val="24"/>
+        </w:rPr>
+      </w:pPr>
+    </w:p>
+    <w:p>
+      <w:pPr>
+        <w:keepNext/>
+        <w:rPr>
+          <w:rFonts w:ascii="Times New Roman" w:hAnsi="Times New Roman" w:cs="Times New Roman"/>
+          <w:sz w:val="24"/>
+          <w:szCs w:val="24"/>
+        </w:rPr>
+      </w:pPr>
+      <w:r>
+        <w:rPr>
+          <w:rFonts w:ascii="Times New Roman" w:hAnsi="Times New Roman" w:cs="Times New Roman"/>
+          <w:b/>
+          <w:bCs/>
+          <w:sz w:val="24"/>
+          <w:szCs w:val="24"/>
+          <w:u w:val="single"/>
+        </w:rPr>
+        <w:t xml:space="preserve">User Story #4</w:t>
+      </w:r>
+    </w:p>
+    <w:p>
+      <w:pPr>
+        <w:keepNext/>
+        <w:rPr>
+          <w:rFonts w:ascii="Times New Roman" w:hAnsi="Times New Roman" w:cs="Times New Roman"/>
+          <w:sz w:val="24"/>
+          <w:szCs w:val="24"/>
+        </w:rPr>
+      </w:pPr>
+      <w:r>
+        <w:rPr>
+          <w:rFonts w:ascii="Times New Roman" w:hAnsi="Times New Roman" w:cs="Times New Roman"/>
+          <w:b/>
+          <w:bCs/>
+          <w:sz w:val="24"/>
+          <w:szCs w:val="24"/>
+        </w:rPr>
+        <w:t xml:space="preserve">Title:</w:t>
+      </w:r>
+      <w:r>
+        <w:rPr>
+          <w:rFonts w:ascii="Times New Roman" w:hAnsi="Times New Roman" w:cs="Times New Roman"/>
+          <w:sz w:val="24"/>
+          <w:szCs w:val="24"/>
+        </w:rPr>
+        <w:t xml:space="preserve"> See the progress of every group in one place.</w:t>
+      </w:r>
+    </w:p>
+    <w:p>
+      <w:pPr>
+        <w:keepNext/>
+        <w:spacing w:after="0"/>
+        <w:rPr>
+          <w:rFonts w:ascii="Times New Roman" w:hAnsi="Times New Roman" w:cs="Times New Roman"/>
+          <w:sz w:val="24"/>
+          <w:szCs w:val="24"/>
+        </w:rPr>
+      </w:pPr>
+      <w:r>
+        <w:rPr>
+          <w:rFonts w:ascii="Times New Roman" w:hAnsi="Times New Roman" w:cs="Times New Roman"/>
+          <w:b/>
+          <w:bCs/>
+          <w:sz w:val="24"/>
+          <w:szCs w:val="24"/>
+        </w:rPr>
+        <w:t xml:space="preserve">Value Statement:</w:t>
+      </w:r>
+    </w:p>
+    <w:p>
+      <w:pPr>
+        <w:rPr>
+          <w:rFonts w:ascii="Times New Roman" w:hAnsi="Times New Roman" w:cs="Times New Roman"/>
+          <w:sz w:val="24"/>
+          <w:szCs w:val="24"/>
+        </w:rPr>
+      </w:pPr>
+      <w:r>
+        <w:rPr>
+          <w:rFonts w:ascii="Times New Roman" w:hAnsi="Times New Roman" w:cs="Times New Roman"/>
+          <w:b/>
+          <w:bCs/>
+          <w:sz w:val="24"/>
+          <w:szCs w:val="24"/>
+        </w:rPr>
+        <w:t xml:space="preserve">As a </w:t>
+      </w:r>
+      <w:r>
+        <w:rPr>
+          <w:rFonts w:ascii="Times New Roman" w:hAnsi="Times New Roman" w:cs="Times New Roman"/>
+          <w:sz w:val="24"/>
+          <w:szCs w:val="24"/>
+        </w:rPr>
+        <w:t xml:space="preserve">dean’s office specialist</w:t>
+      </w:r>
+      <w:r>
+        <w:rPr>
+          <w:rFonts w:ascii="Times New Roman" w:hAnsi="Times New Roman" w:cs="Times New Roman"/>
+          <w:b/>
+          <w:bCs/>
+          <w:sz w:val="24"/>
+          <w:szCs w:val="24"/>
+        </w:rPr>
+        <w:t xml:space="preserve">, I want </w:t>
+      </w:r>
+      <w:r>
+        <w:rPr>
+          <w:rFonts w:ascii="Times New Roman" w:hAnsi="Times New Roman" w:cs="Times New Roman"/>
+          <w:sz w:val="24"/>
+          <w:szCs w:val="24"/>
+        </w:rPr>
+        <w:t xml:space="preserve">to see the progress of every group of my institute on one page</w:t>
+      </w:r>
+      <w:r>
+        <w:rPr>
+          <w:rFonts w:ascii="Times New Roman" w:hAnsi="Times New Roman" w:cs="Times New Roman"/>
+          <w:b/>
+          <w:bCs/>
+          <w:sz w:val="24"/>
+          <w:szCs w:val="24"/>
+        </w:rPr>
+        <w:t xml:space="preserve">, so that </w:t>
+      </w:r>
+      <w:r>
+        <w:rPr>
+          <w:rFonts w:ascii="Times New Roman" w:hAnsi="Times New Roman" w:cs="Times New Roman"/>
+          <w:sz w:val="24"/>
+          <w:szCs w:val="24"/>
+        </w:rPr>
+        <w:t xml:space="preserve">I find students who are falling behind while they can still catch up, without collecting grades by hand.</w:t>
+      </w:r>
+    </w:p>
+    <w:p>
+      <w:pPr>
+        <w:keepNext/>
+        <w:rPr>
+          <w:rFonts w:ascii="Times New Roman" w:hAnsi="Times New Roman" w:cs="Times New Roman"/>
+          <w:sz w:val="24"/>
+          <w:szCs w:val="24"/>
+        </w:rPr>
+      </w:pPr>
+      <w:r>
+        <w:rPr>
+          <w:rFonts w:ascii="Times New Roman" w:hAnsi="Times New Roman" w:cs="Times New Roman"/>
+          <w:b/>
+          <w:bCs/>
+          <w:sz w:val="24"/>
+          <w:szCs w:val="24"/>
+          <w:u w:val="single"/>
+        </w:rPr>
+        <w:t xml:space="preserve">Acceptance Criteria #1:</w:t>
+      </w:r>
+      <w:r>
+        <w:rPr>
+          <w:rFonts w:ascii="Times New Roman" w:hAnsi="Times New Roman" w:cs="Times New Roman"/>
+          <w:sz w:val="24"/>
+          <w:szCs w:val="24"/>
+        </w:rPr>
+        <w:t xml:space="preserve"> List of groups</w:t>
+      </w:r>
+    </w:p>
+    <w:p>
+      <w:pPr>
+        <w:keepNext/>
+        <w:spacing w:after="60"/>
+        <w:rPr>
+          <w:rFonts w:ascii="Times New Roman" w:hAnsi="Times New Roman" w:cs="Times New Roman"/>
+          <w:sz w:val="24"/>
+          <w:szCs w:val="24"/>
+        </w:rPr>
+      </w:pPr>
+      <w:r>
+        <w:rPr>
+          <w:rFonts w:ascii="Times New Roman" w:hAnsi="Times New Roman" w:cs="Times New Roman"/>
+          <w:b/>
+          <w:bCs/>
+          <w:sz w:val="24"/>
+          <w:szCs w:val="24"/>
+        </w:rPr>
+        <w:t xml:space="preserve">Given</w:t>
+      </w:r>
+      <w:r>
+        <w:rPr>
+          <w:rFonts w:ascii="Times New Roman" w:hAnsi="Times New Roman" w:cs="Times New Roman"/>
+          <w:sz w:val="24"/>
+          <w:szCs w:val="24"/>
+        </w:rPr>
+        <w:t xml:space="preserve"> Specialist is signed in to the platform</w:t>
+      </w:r>
+    </w:p>
+    <w:p>
+      <w:pPr>
+        <w:keepNext/>
+        <w:spacing w:after="60"/>
+        <w:ind w:firstLine="720"/>
+        <w:rPr>
+          <w:rFonts w:ascii="Times New Roman" w:hAnsi="Times New Roman" w:cs="Times New Roman"/>
+          <w:sz w:val="24"/>
+          <w:szCs w:val="24"/>
+        </w:rPr>
+      </w:pPr>
+      <w:r>
+        <w:rPr>
+          <w:rFonts w:ascii="Times New Roman" w:hAnsi="Times New Roman" w:cs="Times New Roman"/>
+          <w:b/>
+          <w:bCs/>
+          <w:sz w:val="24"/>
+          <w:szCs w:val="24"/>
+        </w:rPr>
+        <w:t xml:space="preserve">And</w:t>
+      </w:r>
+      <w:r>
+        <w:rPr>
+          <w:rFonts w:ascii="Times New Roman" w:hAnsi="Times New Roman" w:cs="Times New Roman"/>
+          <w:sz w:val="24"/>
+          <w:szCs w:val="24"/>
+        </w:rPr>
+        <w:t xml:space="preserve"> Specialist has access to the Institute of Computer Science</w:t>
+      </w:r>
+    </w:p>
+    <w:p>
+      <w:pPr>
+        <w:keepNext/>
+        <w:spacing w:after="60"/>
+        <w:rPr>
+          <w:rFonts w:ascii="Times New Roman" w:hAnsi="Times New Roman" w:cs="Times New Roman"/>
+          <w:sz w:val="24"/>
+          <w:szCs w:val="24"/>
+        </w:rPr>
+      </w:pPr>
+      <w:r>
+        <w:rPr>
+          <w:rFonts w:ascii="Times New Roman" w:hAnsi="Times New Roman" w:cs="Times New Roman"/>
+          <w:b/>
+          <w:bCs/>
+          <w:sz w:val="24"/>
+          <w:szCs w:val="24"/>
+        </w:rPr>
+        <w:t xml:space="preserve">When</w:t>
+      </w:r>
+      <w:r>
+        <w:rPr>
+          <w:rFonts w:ascii="Times New Roman" w:hAnsi="Times New Roman" w:cs="Times New Roman"/>
+          <w:sz w:val="24"/>
+          <w:szCs w:val="24"/>
+        </w:rPr>
+        <w:t xml:space="preserve"> Specialist opens the “Groups” page</w:t>
+      </w:r>
+    </w:p>
+    <w:p>
+      <w:pPr>
+        <w:keepNext/>
+        <w:spacing w:after="60"/>
+        <w:rPr>
+          <w:rFonts w:ascii="Times New Roman" w:hAnsi="Times New Roman" w:cs="Times New Roman"/>
+          <w:sz w:val="24"/>
+          <w:szCs w:val="24"/>
+        </w:rPr>
+      </w:pPr>
+      <w:r>
+        <w:rPr>
+          <w:rFonts w:ascii="Times New Roman" w:hAnsi="Times New Roman" w:cs="Times New Roman"/>
+          <w:b/>
+          <w:bCs/>
+          <w:sz w:val="24"/>
+          <w:szCs w:val="24"/>
+        </w:rPr>
+        <w:t xml:space="preserve">Then</w:t>
+      </w:r>
+      <w:r>
+        <w:rPr>
+          <w:rFonts w:ascii="Times New Roman" w:hAnsi="Times New Roman" w:cs="Times New Roman"/>
+          <w:sz w:val="24"/>
+          <w:szCs w:val="24"/>
+        </w:rPr>
+        <w:t xml:space="preserve"> Specialist sees all groups of the institute with the average progress in points of 100</w:t>
+      </w:r>
+    </w:p>
+    <w:p>
+      <w:pPr>
+        <w:ind w:firstLine="720"/>
+        <w:rPr>
+          <w:rFonts w:ascii="Times New Roman" w:hAnsi="Times New Roman" w:cs="Times New Roman"/>
+          <w:sz w:val="24"/>
+          <w:szCs w:val="24"/>
+        </w:rPr>
+      </w:pPr>
+      <w:r>
+        <w:rPr>
+          <w:rFonts w:ascii="Times New Roman" w:hAnsi="Times New Roman" w:cs="Times New Roman"/>
+          <w:b/>
+          <w:bCs/>
+          <w:sz w:val="24"/>
+          <w:szCs w:val="24"/>
+        </w:rPr>
+        <w:t xml:space="preserve">And</w:t>
+      </w:r>
+      <w:r>
+        <w:rPr>
+          <w:rFonts w:ascii="Times New Roman" w:hAnsi="Times New Roman" w:cs="Times New Roman"/>
+          <w:sz w:val="24"/>
+          <w:szCs w:val="24"/>
+        </w:rPr>
+        <w:t xml:space="preserve"> each group shows the number of missed deadlines</w:t>
+      </w:r>
+    </w:p>
+    <w:p>
+      <w:pPr>
+        <w:keepNext/>
+        <w:rPr>
+          <w:rFonts w:ascii="Times New Roman" w:hAnsi="Times New Roman" w:cs="Times New Roman"/>
+          <w:sz w:val="24"/>
+          <w:szCs w:val="24"/>
+        </w:rPr>
+      </w:pPr>
+      <w:r>
+        <w:rPr>
+          <w:rFonts w:ascii="Times New Roman" w:hAnsi="Times New Roman" w:cs="Times New Roman"/>
+          <w:b/>
+          <w:bCs/>
+          <w:sz w:val="24"/>
+          <w:szCs w:val="24"/>
+          <w:u w:val="single"/>
+        </w:rPr>
+        <w:t xml:space="preserve">Acceptance Criteria #2:</w:t>
+      </w:r>
+      <w:r>
+        <w:rPr>
+          <w:rFonts w:ascii="Times New Roman" w:hAnsi="Times New Roman" w:cs="Times New Roman"/>
+          <w:sz w:val="24"/>
+          <w:szCs w:val="24"/>
+        </w:rPr>
+        <w:t xml:space="preserve"> Students at risk in a group</w:t>
+      </w:r>
+    </w:p>
+    <w:p>
+      <w:pPr>
+        <w:keepNext/>
+        <w:spacing w:after="60"/>
+        <w:rPr>
+          <w:rFonts w:ascii="Times New Roman" w:hAnsi="Times New Roman" w:cs="Times New Roman"/>
+          <w:sz w:val="24"/>
+          <w:szCs w:val="24"/>
+        </w:rPr>
+      </w:pPr>
+      <w:r>
+        <w:rPr>
+          <w:rFonts w:ascii="Times New Roman" w:hAnsi="Times New Roman" w:cs="Times New Roman"/>
+          <w:b/>
+          <w:bCs/>
+          <w:sz w:val="24"/>
+          <w:szCs w:val="24"/>
+        </w:rPr>
+        <w:t xml:space="preserve">Given</w:t>
+      </w:r>
+      <w:r>
+        <w:rPr>
+          <w:rFonts w:ascii="Times New Roman" w:hAnsi="Times New Roman" w:cs="Times New Roman"/>
+          <w:sz w:val="24"/>
+          <w:szCs w:val="24"/>
+        </w:rPr>
+        <w:t xml:space="preserve"> Specialist is on the “Groups” page</w:t>
+      </w:r>
+    </w:p>
+    <w:p>
+      <w:pPr>
+        <w:keepNext/>
+        <w:spacing w:after="60"/>
+        <w:ind w:firstLine="720"/>
+        <w:rPr>
+          <w:rFonts w:ascii="Times New Roman" w:hAnsi="Times New Roman" w:cs="Times New Roman"/>
+          <w:sz w:val="24"/>
+          <w:szCs w:val="24"/>
+        </w:rPr>
+      </w:pPr>
+      <w:r>
+        <w:rPr>
+          <w:rFonts w:ascii="Times New Roman" w:hAnsi="Times New Roman" w:cs="Times New Roman"/>
+          <w:b/>
+          <w:bCs/>
+          <w:sz w:val="24"/>
+          <w:szCs w:val="24"/>
+        </w:rPr>
+        <w:t xml:space="preserve">And</w:t>
+      </w:r>
+      <w:r>
+        <w:rPr>
+          <w:rFonts w:ascii="Times New Roman" w:hAnsi="Times New Roman" w:cs="Times New Roman"/>
+          <w:sz w:val="24"/>
+          <w:szCs w:val="24"/>
+        </w:rPr>
+        <w:t xml:space="preserve"> the group “KN-11” has a student with 3 missed deadlines</w:t>
+      </w:r>
+    </w:p>
+    <w:p>
+      <w:pPr>
+        <w:keepNext/>
+        <w:spacing w:after="60"/>
+        <w:rPr>
+          <w:rFonts w:ascii="Times New Roman" w:hAnsi="Times New Roman" w:cs="Times New Roman"/>
+          <w:sz w:val="24"/>
+          <w:szCs w:val="24"/>
+        </w:rPr>
+      </w:pPr>
+      <w:r>
+        <w:rPr>
+          <w:rFonts w:ascii="Times New Roman" w:hAnsi="Times New Roman" w:cs="Times New Roman"/>
+          <w:b/>
+          <w:bCs/>
+          <w:sz w:val="24"/>
+          <w:szCs w:val="24"/>
+        </w:rPr>
+        <w:t xml:space="preserve">When</w:t>
+      </w:r>
+      <w:r>
+        <w:rPr>
+          <w:rFonts w:ascii="Times New Roman" w:hAnsi="Times New Roman" w:cs="Times New Roman"/>
+          <w:sz w:val="24"/>
+          <w:szCs w:val="24"/>
+        </w:rPr>
+        <w:t xml:space="preserve"> Specialist opens the group “KN-11”</w:t>
+      </w:r>
+    </w:p>
+    <w:p>
+      <w:pPr>
+        <w:keepNext/>
+        <w:spacing w:after="60"/>
+        <w:rPr>
+          <w:rFonts w:ascii="Times New Roman" w:hAnsi="Times New Roman" w:cs="Times New Roman"/>
+          <w:sz w:val="24"/>
+          <w:szCs w:val="24"/>
+        </w:rPr>
+      </w:pPr>
+      <w:r>
+        <w:rPr>
+          <w:rFonts w:ascii="Times New Roman" w:hAnsi="Times New Roman" w:cs="Times New Roman"/>
+          <w:b/>
+          <w:bCs/>
+          <w:sz w:val="24"/>
+          <w:szCs w:val="24"/>
+        </w:rPr>
+        <w:t xml:space="preserve">Then</w:t>
+      </w:r>
+      <w:r>
+        <w:rPr>
+          <w:rFonts w:ascii="Times New Roman" w:hAnsi="Times New Roman" w:cs="Times New Roman"/>
+          <w:sz w:val="24"/>
+          <w:szCs w:val="24"/>
+        </w:rPr>
+        <w:t xml:space="preserve"> Specialist sees every student of the group with the progress in points and the number of missed deadlines</w:t>
+      </w:r>
+    </w:p>
+    <w:p>
+      <w:pPr>
+        <w:ind w:firstLine="720"/>
+        <w:rPr>
+          <w:rFonts w:ascii="Times New Roman" w:hAnsi="Times New Roman" w:cs="Times New Roman"/>
+          <w:sz w:val="24"/>
+          <w:szCs w:val="24"/>
+        </w:rPr>
+      </w:pPr>
+      <w:r>
+        <w:rPr>
+          <w:rFonts w:ascii="Times New Roman" w:hAnsi="Times New Roman" w:cs="Times New Roman"/>
+          <w:b/>
+          <w:bCs/>
+          <w:sz w:val="24"/>
+          <w:szCs w:val="24"/>
+        </w:rPr>
+        <w:t xml:space="preserve">And</w:t>
+      </w:r>
+      <w:r>
+        <w:rPr>
+          <w:rFonts w:ascii="Times New Roman" w:hAnsi="Times New Roman" w:cs="Times New Roman"/>
+          <w:sz w:val="24"/>
+          <w:szCs w:val="24"/>
+        </w:rPr>
+        <w:t xml:space="preserve"> the student with 3 missed deadlines is marked “At risk”</w:t>
+      </w:r>
+    </w:p>
+    <w:p>
+      <w:pPr>
+        <w:keepNext/>
+        <w:rPr>
+          <w:rFonts w:ascii="Times New Roman" w:hAnsi="Times New Roman" w:cs="Times New Roman"/>
+          <w:sz w:val="24"/>
+          <w:szCs w:val="24"/>
+        </w:rPr>
+      </w:pPr>
+      <w:r>
+        <w:rPr>
+          <w:rFonts w:ascii="Times New Roman" w:hAnsi="Times New Roman" w:cs="Times New Roman"/>
+          <w:b/>
+          <w:bCs/>
+          <w:sz w:val="24"/>
+          <w:szCs w:val="24"/>
+          <w:u w:val="single"/>
+        </w:rPr>
+        <w:t xml:space="preserve">Acceptance Criteria #3:</w:t>
+      </w:r>
+      <w:r>
+        <w:rPr>
+          <w:rFonts w:ascii="Times New Roman" w:hAnsi="Times New Roman" w:cs="Times New Roman"/>
+          <w:sz w:val="24"/>
+          <w:szCs w:val="24"/>
+        </w:rPr>
+        <w:t xml:space="preserve"> A group of another institute</w:t>
+      </w:r>
+    </w:p>
+    <w:p>
+      <w:pPr>
+        <w:keepNext/>
+        <w:spacing w:after="60"/>
+        <w:rPr>
+          <w:rFonts w:ascii="Times New Roman" w:hAnsi="Times New Roman" w:cs="Times New Roman"/>
+          <w:sz w:val="24"/>
+          <w:szCs w:val="24"/>
+        </w:rPr>
+      </w:pPr>
+      <w:r>
+        <w:rPr>
+          <w:rFonts w:ascii="Times New Roman" w:hAnsi="Times New Roman" w:cs="Times New Roman"/>
+          <w:b/>
+          <w:bCs/>
+          <w:sz w:val="24"/>
+          <w:szCs w:val="24"/>
+        </w:rPr>
+        <w:t xml:space="preserve">Given</w:t>
+      </w:r>
+      <w:r>
+        <w:rPr>
+          <w:rFonts w:ascii="Times New Roman" w:hAnsi="Times New Roman" w:cs="Times New Roman"/>
+          <w:sz w:val="24"/>
+          <w:szCs w:val="24"/>
+        </w:rPr>
+        <w:t xml:space="preserve"> Specialist has no access to the group “FI-21” of another institute</w:t>
+      </w:r>
+    </w:p>
+    <w:p>
+      <w:pPr>
+        <w:keepNext/>
+        <w:spacing w:after="60"/>
+        <w:rPr>
+          <w:rFonts w:ascii="Times New Roman" w:hAnsi="Times New Roman" w:cs="Times New Roman"/>
+          <w:sz w:val="24"/>
+          <w:szCs w:val="24"/>
+        </w:rPr>
+      </w:pPr>
+      <w:r>
+        <w:rPr>
+          <w:rFonts w:ascii="Times New Roman" w:hAnsi="Times New Roman" w:cs="Times New Roman"/>
+          <w:b/>
+          <w:bCs/>
+          <w:sz w:val="24"/>
+          <w:szCs w:val="24"/>
+        </w:rPr>
+        <w:t xml:space="preserve">When</w:t>
+      </w:r>
+      <w:r>
+        <w:rPr>
+          <w:rFonts w:ascii="Times New Roman" w:hAnsi="Times New Roman" w:cs="Times New Roman"/>
+          <w:sz w:val="24"/>
+          <w:szCs w:val="24"/>
+        </w:rPr>
+        <w:t xml:space="preserve"> Specialist opens the page of the group “FI-21”</w:t>
+      </w:r>
+    </w:p>
+    <w:p>
+      <w:pPr>
+        <w:keepNext/>
+        <w:spacing w:after="60"/>
+        <w:rPr>
+          <w:rFonts w:ascii="Times New Roman" w:hAnsi="Times New Roman" w:cs="Times New Roman"/>
+          <w:sz w:val="24"/>
+          <w:szCs w:val="24"/>
+        </w:rPr>
+      </w:pPr>
+      <w:r>
+        <w:rPr>
+          <w:rFonts w:ascii="Times New Roman" w:hAnsi="Times New Roman" w:cs="Times New Roman"/>
+          <w:b/>
+          <w:bCs/>
+          <w:sz w:val="24"/>
+          <w:szCs w:val="24"/>
+        </w:rPr>
+        <w:t xml:space="preserve">Then</w:t>
+      </w:r>
+      <w:r>
+        <w:rPr>
+          <w:rFonts w:ascii="Times New Roman" w:hAnsi="Times New Roman" w:cs="Times New Roman"/>
+          <w:sz w:val="24"/>
+          <w:szCs w:val="24"/>
+        </w:rPr>
+        <w:t xml:space="preserve"> System does not show the group</w:t>
+      </w:r>
+    </w:p>
+    <w:p>
+      <w:pPr>
+        <w:keepNext/>
+        <w:spacing w:after="60"/>
+        <w:ind w:firstLine="720"/>
+        <w:rPr>
+          <w:rFonts w:ascii="Times New Roman" w:hAnsi="Times New Roman" w:cs="Times New Roman"/>
+          <w:sz w:val="24"/>
+          <w:szCs w:val="24"/>
+        </w:rPr>
+      </w:pPr>
+      <w:r>
+        <w:rPr>
+          <w:rFonts w:ascii="Times New Roman" w:hAnsi="Times New Roman" w:cs="Times New Roman"/>
+          <w:b/>
+          <w:bCs/>
+          <w:sz w:val="24"/>
+          <w:szCs w:val="24"/>
+        </w:rPr>
+        <w:t xml:space="preserve">And</w:t>
+      </w:r>
+      <w:r>
+        <w:rPr>
+          <w:rFonts w:ascii="Times New Roman" w:hAnsi="Times New Roman" w:cs="Times New Roman"/>
+          <w:sz w:val="24"/>
+          <w:szCs w:val="24"/>
+        </w:rPr>
+        <w:t xml:space="preserve"> System shows the message “You do not have access to this page”</w:t>
+      </w:r>
+    </w:p>
+    <w:p>
+      <w:pPr>
+        <w:ind w:firstLine="720"/>
+        <w:rPr>
+          <w:rFonts w:ascii="Times New Roman" w:hAnsi="Times New Roman" w:cs="Times New Roman"/>
+          <w:sz w:val="24"/>
+          <w:szCs w:val="24"/>
+        </w:rPr>
+      </w:pPr>
+      <w:r>
+        <w:rPr>
+          <w:rFonts w:ascii="Times New Roman" w:hAnsi="Times New Roman" w:cs="Times New Roman"/>
+          <w:b/>
+          <w:bCs/>
+          <w:sz w:val="24"/>
+          <w:szCs w:val="24"/>
+        </w:rPr>
+        <w:t xml:space="preserve">And</w:t>
+      </w:r>
+      <w:r>
+        <w:rPr>
+          <w:rFonts w:ascii="Times New Roman" w:hAnsi="Times New Roman" w:cs="Times New Roman"/>
+          <w:sz w:val="24"/>
+          <w:szCs w:val="24"/>
+        </w:rPr>
+        <w:t xml:space="preserve"> no student data is shown</w:t>
       </w:r>
     </w:p>
     <w:sectPr>

</xml_diff>